<commit_message>
Restore original forum speech wording.
Keep the source text, drop the duplicated sentence, and only move the Tatarstan and Henan paragraphs ahead of the company introduction.

Co-authored-by: liborvybral-collab <liborvybral-collab@users.noreply.github.com>
</commit_message>
<xml_diff>
--- a/docs/speeches/2026-08/2026-08-萌芽论坛-鞑靼斯坦演讲稿.docx
+++ b/docs/speeches/2026-08/2026-08-萌芽论坛-鞑靼斯坦演讲稿.docx
@@ -27,7 +27,7 @@
           <w:b w:val="0"/>
           <w:sz w:val="32"/>
         </w:rPr>
-        <w:t>尊敬的明尼哈诺夫行政长官阁下，尊敬的各位领导、各位企业家朋友：</w:t>
+        <w:t>尊敬的明尼哈诺夫主席阁下，尊敬的各位领导、各位企业家朋友：</w:t>
       </w:r>
     </w:p>
     <w:p>
@@ -47,7 +47,7 @@
     <w:p>
       <w:pPr>
         <w:spacing w:line="384" w:lineRule="auto" w:after="200"/>
-        <w:ind w:firstLine="839"/>
+        <w:ind w:firstLine="420"/>
       </w:pPr>
       <w:r>
         <w:rPr>
@@ -55,13 +55,13 @@
           <w:b w:val="0"/>
           <w:sz w:val="32"/>
         </w:rPr>
-        <w:t>非常荣幸参加第四届“萌芽：俄罗斯和中国——互利合作”国际论坛。感谢鞑靼斯坦共和国政府给予我们这次交流机会。请允许我代表河南实荣筒仓工程有限公司，向长期推动中俄地方交流与产业合作的各位领导，表示诚挚的感谢。</w:t>
+        <w:t>非常荣幸参加第四届“萌芽：俄罗斯—中国”国际论坛，也非常感谢鞑靼斯坦共和国政府给予我们这次交流机会。</w:t>
       </w:r>
     </w:p>
     <w:p>
       <w:pPr>
         <w:spacing w:line="384" w:lineRule="auto" w:after="200"/>
-        <w:ind w:firstLine="839"/>
+        <w:ind w:firstLine="420"/>
       </w:pPr>
       <w:r>
         <w:rPr>
@@ -69,13 +69,13 @@
           <w:b w:val="0"/>
           <w:sz w:val="32"/>
         </w:rPr>
-        <w:t>当前，中俄两国关系持续深入发展，地方之间、企业之间的合作也在不断扩大。我们认为，地方产业合作是连接两国经济的重要基础，也是把两国互补优势变成具体项目的关键环节。对实荣来说，参加这次论坛，不只是一次商务交流，更是把已经开始的对话，推向具体合作的重要机会。</w:t>
+        <w:t>借此机会，请允许我代表河南实荣筒仓工程有限公司，向长期推动中俄地方交流与产业合作的各位领导表示诚挚的感谢。</w:t>
       </w:r>
     </w:p>
     <w:p>
       <w:pPr>
         <w:spacing w:line="384" w:lineRule="auto" w:after="200"/>
-        <w:ind w:firstLine="839"/>
+        <w:ind w:firstLine="420"/>
       </w:pPr>
       <w:r>
         <w:rPr>
@@ -83,13 +83,13 @@
           <w:b w:val="0"/>
           <w:sz w:val="32"/>
         </w:rPr>
-        <w:t>今年 7 月，实荣已经来到鞑靼斯坦，与投资发展局、农业与食品部、工业与贸易部进行过工作对接。当时双方重点交流了粮食储运设施升级、既有仓储改造，以及工业散料储运等议题。俄方各部门务实、高效，对合作成果看得很重，给我们留下了深刻印象。今天再次来到喀山，就是希望把这些讨论，变成可以落地的合作方向。</w:t>
+        <w:t>当前，中俄两国关系持续深入发展，地方之间、企业之间的交流合作也正在不断扩大。我们认为，地方产业合作是连接两国经济的重要基础，也是推动双方长期发展的重要力量。</w:t>
       </w:r>
     </w:p>
     <w:p>
       <w:pPr>
         <w:spacing w:line="384" w:lineRule="auto" w:after="200"/>
-        <w:ind w:firstLine="839"/>
+        <w:ind w:firstLine="420"/>
       </w:pPr>
       <w:r>
         <w:rPr>
@@ -97,13 +97,13 @@
           <w:b w:val="0"/>
           <w:sz w:val="32"/>
         </w:rPr>
-        <w:t>河南实荣筒仓工程有限公司，品牌名 SRON，是一家面向全球的大宗散料储运工程系统解决方案提供商。我们为粮食、矿产、建材、煤炭等行业，提供筒仓工程、封闭料场、快速装车和码头装卸等 EPC 总承包服务，具备从工程设计、装备制造、施工安装到调试运维的全链条交付能力。经过多年发展，公司已在全球 40 多个国家和地区开展项目合作，累计建成钢板仓及散料堆场 900 余座，总储存能力超过 300 万吨。这些项目里，既有粮食仓储，也有水泥、矿粉等工业散料设施。因此，我们既服务农业储备，也服务工厂配套。</w:t>
+        <w:t>今天来到鞑靼斯坦，对SRON而言，不仅是一次商务交流，更是一次深入了解当地发展需求、寻找长期合作的重要机会。</w:t>
       </w:r>
     </w:p>
     <w:p>
       <w:pPr>
         <w:spacing w:line="384" w:lineRule="auto" w:after="200"/>
-        <w:ind w:firstLine="839"/>
+        <w:ind w:firstLine="420"/>
       </w:pPr>
       <w:r>
         <w:rPr>
@@ -111,13 +111,13 @@
           <w:b w:val="0"/>
           <w:sz w:val="32"/>
         </w:rPr>
-        <w:t>我们的核心能力，不是提供单一设备，而是围绕产业发展的实际需求，把工程技术、装备制造和项目管理结合起来，为客户建设安全、高效、环保、智能的现代化储运基础设施。</w:t>
+        <w:t>我们一直关注俄罗斯市场的发展机会，也非常关注鞑靼斯坦共和国的发展。在我们看来，鞑靼斯坦是俄罗斯重要的工业和农业发展区域，拥有良好的产业基础。同时，鞑靼斯坦具有重要的区位优势，是连接俄罗斯欧洲部分与欧亚大陆的重要节点，也是“一带一路”的重要合作节点之一。在此前与鞑靼斯坦方面的交流过程中，我们对这里留下了非常深刻的印象。特别是鞑靼斯坦政府务实、高效的工作作风，以及对合作实际成果的重视，让我们更加坚定了进一步加强合作的想法。</w:t>
       </w:r>
     </w:p>
     <w:p>
       <w:pPr>
         <w:spacing w:line="384" w:lineRule="auto" w:after="200"/>
-        <w:ind w:firstLine="839"/>
+        <w:ind w:firstLine="420"/>
       </w:pPr>
       <w:r>
         <w:rPr>
@@ -125,13 +125,13 @@
           <w:b w:val="0"/>
           <w:sz w:val="32"/>
         </w:rPr>
-        <w:t>我们一直关注俄罗斯市场，也高度关注鞑靼斯坦的发展。鞑靼斯坦是俄罗斯重要的工业和农业地区，石油化工、机械制造、建材和现代农业基础扎实；同时地处伏尔加河流域，是连接欧洲俄罗斯与乌拉尔以东的重要枢纽。对粮食和工业散料来说，这样的区位意味着储存、转运和装车都会成为产业发展的配套环节。更让我们印象深刻的是，鞑靼斯坦政府务实、高效，重视合作的实际成果。这让我们相信，这里适合做长期、具体的产业合作。</w:t>
+        <w:t>同时，我们也非常重视河南与鞑靼斯坦之间已经形成的良好合作基础。</w:t>
       </w:r>
     </w:p>
     <w:p>
       <w:pPr>
         <w:spacing w:line="384" w:lineRule="auto" w:after="200"/>
-        <w:ind w:firstLine="839"/>
+        <w:ind w:firstLine="420"/>
       </w:pPr>
       <w:r>
         <w:rPr>
@@ -139,13 +139,13 @@
           <w:b w:val="0"/>
           <w:sz w:val="32"/>
         </w:rPr>
-        <w:t>河南是中国重要的农业和工业大省，在粮食生产、装备制造和工程产业方面有完整配套。双方在农业、粮食仓储、工业基础设施和物流领域，具有很强的互补性。实荣希望以企业项目为切入点，先把能做的事先做起来，为两地产业对接做实事。</w:t>
+        <w:t>河南是中国重要的农业和工业大省，鞑靼斯坦同样拥有雄厚的工业基础和现代农业基础。双方在农业、粮食、装备制造、工业基础设施和物流等领域具有很强的互补性。对于SRON而言，我们希望推动的不只是企业之间的项目合作，也能够积极参与河南与鞑靼斯坦之间更加深入的地方产业合作。</w:t>
       </w:r>
     </w:p>
     <w:p>
       <w:pPr>
         <w:spacing w:line="384" w:lineRule="auto" w:after="200"/>
-        <w:ind w:firstLine="839"/>
+        <w:ind w:firstLine="420"/>
       </w:pPr>
       <w:r>
         <w:rPr>
@@ -153,13 +153,13 @@
           <w:b w:val="0"/>
           <w:sz w:val="32"/>
         </w:rPr>
-        <w:t>在农业领域，粮食安全是长期发展的基础。鞑靼斯坦冬季寒冷、温差明显，粮食仓储既要解决储存容量，也要应对雪荷载、低温和温差结露。结露会造成粮食受潮、品质下降，并增加破碎和损耗风险。针对这些条件，我们重点推广保温型粮食仓储技术，通过保温、通风和粮情监测，提高储粮安全性，降低长期运行能耗。结合 7 月与农业部门的交流，我们认为，既有粮仓的升级改造，和新建现代化仓储设施，往往比概念性方案更贴近当前需要。我们愿意围绕本地储备和粮食外运，参与仓储、通风、监测和装车环节的具体工作，并按当地气候、荷载和运行条件来做方案，而不是简单套用现成产品。</w:t>
+        <w:t>河南实荣筒仓工程有限公司是一家面向全球的大宗散料储运工程系统解决方案提供商，专注于为粮食、矿产、建材、煤炭等行业提供安全可靠、技术领先、低碳环保的筒仓工程系统、封闭料场系统、快速装车系统及码头装卸系统等EPC总承包服务，具备从工程设计、装备制造、施工管理到安装调试及运维服务的全链条交付能力。公司深度融合物联网、数字孪生等先进技术打造智慧储运管理系统，实现对物料从卸料、输送、存储到装车的全流程智能化管控与可视化运维，并结合光伏储能、无人机巡检等平台，助力客户提升运营效率，实现节能降耗与可持续发展。</w:t>
       </w:r>
     </w:p>
     <w:p>
       <w:pPr>
         <w:spacing w:line="384" w:lineRule="auto" w:after="200"/>
-        <w:ind w:firstLine="839"/>
+        <w:ind w:firstLine="420"/>
       </w:pPr>
       <w:r>
         <w:rPr>
@@ -167,13 +167,13 @@
           <w:b w:val="0"/>
           <w:sz w:val="32"/>
         </w:rPr>
-        <w:t>在工业领域，鞑靼斯坦在建材、能源和制造业上优势明显。水泥、矿粉、煤炭等散料的储存、转运和装车，直接关系到工厂运行效率、粉尘控制和现场环境。工业储运做得好，工厂更稳；做得不好，损耗、污染和物流成本都会上去。对园区和工厂来说，散料设施往往不是主体工程，却是影响长期运行的关键配套。我们希望把在水泥、矿产、煤炭等领域的工程经验带到这里，为当地企业提供可靠的散料储运方案，包括筒仓系统、封闭料场和快速装车系统，服务工厂配套和园区物流。</w:t>
+        <w:t>经过多年的发展，SRON已经在全球40多个国家和地区开展项目合作，成功建设超过1000座筒仓，总储存能力超过300万吨。</w:t>
       </w:r>
     </w:p>
     <w:p>
       <w:pPr>
         <w:spacing w:line="384" w:lineRule="auto" w:after="200"/>
-        <w:ind w:firstLine="839"/>
+        <w:ind w:firstLine="420"/>
       </w:pPr>
       <w:r>
         <w:rPr>
@@ -181,13 +181,13 @@
           <w:b w:val="0"/>
           <w:sz w:val="32"/>
         </w:rPr>
-        <w:t>真正有价值的合作，不应停留在单次交流或单个意向上，而应形成可执行、可跟踪的项目。目前，SRON 已经在莫斯科完成注册并成立俄罗斯运营公司，作为长期服务俄罗斯市场、加强本地合作的平台。莫斯科公司是我们面向全俄市场的服务入口；鞑靼斯坦则是我们深化产业布局的优先区域。两者并不矛盾：一个负责长期在场，一个负责把项目做实。</w:t>
+        <w:t>我们的核心能力并不仅仅是提供单一设备，而是围绕产业发展的实际需求，通过工程技术、装备制造和项目管理能力，为客户建设安全、高效、环保、智能化的现代化基础设施。</w:t>
       </w:r>
     </w:p>
     <w:p>
       <w:pPr>
         <w:spacing w:line="384" w:lineRule="auto" w:after="200"/>
-        <w:ind w:firstLine="839"/>
+        <w:ind w:firstLine="420"/>
       </w:pPr>
       <w:r>
         <w:rPr>
@@ -195,7 +195,133 @@
           <w:b w:val="0"/>
           <w:sz w:val="32"/>
         </w:rPr>
-        <w:t>因此，我们将以莫斯科公司为平台，以鞑靼斯坦为重点，优先配置工程服务、调试运维、备件支持和专业人员。项目方向一旦明确，我们就愿意进一步研究在当地建设必要的生产和服务能力，把更多技术、设备和专业团队放到这里。</w:t>
+        <w:t>在农业领域，粮食安全和农业现代化是长期发展的重要基础。</w:t>
+      </w:r>
+    </w:p>
+    <w:p>
+      <w:pPr>
+        <w:spacing w:line="384" w:lineRule="auto" w:after="200"/>
+        <w:ind w:firstLine="420"/>
+      </w:pPr>
+      <w:r>
+        <w:rPr>
+          <w:rFonts w:ascii="Times New Roman" w:hAnsi="Times New Roman" w:eastAsia="宋体"/>
+          <w:b w:val="0"/>
+          <w:sz w:val="32"/>
+        </w:rPr>
+        <w:t>对于俄罗斯高纬度、高寒地区而言，粮食储存除了容量问题，还需要重点解决低温、雪荷载和温差结露等问题。结露可能造成粮食受潮、品质下降，并增加粮食破碎和损耗风险。</w:t>
+      </w:r>
+    </w:p>
+    <w:p>
+      <w:pPr>
+        <w:spacing w:line="384" w:lineRule="auto" w:after="200"/>
+        <w:ind w:firstLine="420"/>
+      </w:pPr>
+      <w:r>
+        <w:rPr>
+          <w:rFonts w:ascii="Times New Roman" w:hAnsi="Times New Roman" w:eastAsia="宋体"/>
+          <w:b w:val="0"/>
+          <w:sz w:val="32"/>
+        </w:rPr>
+        <w:t>针对这些实际需求，SRON正在重点研究和推广保温型粮食仓储技术，通过保温、通风和粮情监测等综合手段，提高储粮安全性，降低长期运行能耗。</w:t>
+      </w:r>
+    </w:p>
+    <w:p>
+      <w:pPr>
+        <w:spacing w:line="384" w:lineRule="auto" w:after="200"/>
+        <w:ind w:firstLine="420"/>
+      </w:pPr>
+      <w:r>
+        <w:rPr>
+          <w:rFonts w:ascii="Times New Roman" w:hAnsi="Times New Roman" w:eastAsia="宋体"/>
+          <w:b w:val="0"/>
+          <w:sz w:val="32"/>
+        </w:rPr>
+        <w:t>同时，我们正在研究地下及半地下粮仓。对于承担重要战略储备任务的地区，这类设施可以利用相对稳定的环境条件，提高粮食储备的安全性和稳定性。未来如有实际需求，我们愿意结合当地条件，与合作伙伴共同研究适合的技术方案。</w:t>
+      </w:r>
+    </w:p>
+    <w:p>
+      <w:pPr>
+        <w:spacing w:line="384" w:lineRule="auto" w:after="200"/>
+        <w:ind w:firstLine="420"/>
+      </w:pPr>
+      <w:r>
+        <w:rPr>
+          <w:rFonts w:ascii="Times New Roman" w:hAnsi="Times New Roman" w:eastAsia="宋体"/>
+          <w:b w:val="0"/>
+          <w:sz w:val="32"/>
+        </w:rPr>
+        <w:t>在工业领域，鞑靼斯坦在建材、矿产、能源等领域具有良好基础。SRON希望依托在水泥、矿产、煤炭等领域的工程经验，为当地企业提供先进、可靠的散料储运解决方案。</w:t>
+      </w:r>
+    </w:p>
+    <w:p>
+      <w:pPr>
+        <w:spacing w:line="384" w:lineRule="auto" w:after="200"/>
+        <w:ind w:firstLine="420"/>
+      </w:pPr>
+      <w:r>
+        <w:rPr>
+          <w:rFonts w:ascii="Times New Roman" w:hAnsi="Times New Roman" w:eastAsia="宋体"/>
+          <w:b w:val="0"/>
+          <w:sz w:val="32"/>
+        </w:rPr>
+        <w:t>同时，我们也正在探索光伏、储能与粮食仓储及工业基础设施的结合，根据当地实际条件优化能源使用方式，降低长期运行能耗。</w:t>
+      </w:r>
+    </w:p>
+    <w:p>
+      <w:pPr>
+        <w:spacing w:line="384" w:lineRule="auto" w:after="200"/>
+        <w:ind w:firstLine="420"/>
+      </w:pPr>
+      <w:r>
+        <w:rPr>
+          <w:rFonts w:ascii="Times New Roman" w:hAnsi="Times New Roman" w:eastAsia="宋体"/>
+          <w:b w:val="0"/>
+          <w:sz w:val="32"/>
+        </w:rPr>
+        <w:t>当然，我们认为，真正有价值的合作，不应该只停留在单个项目层面，而应该逐步形成长期、稳定、深入的产业合作关系。</w:t>
+      </w:r>
+    </w:p>
+    <w:p>
+      <w:pPr>
+        <w:spacing w:line="384" w:lineRule="auto" w:after="200"/>
+        <w:ind w:firstLine="420"/>
+      </w:pPr>
+      <w:r>
+        <w:rPr>
+          <w:rFonts w:ascii="Times New Roman" w:hAnsi="Times New Roman" w:eastAsia="宋体"/>
+          <w:b w:val="0"/>
+          <w:sz w:val="32"/>
+        </w:rPr>
+        <w:t>目前，SRON已经在莫斯科完成注册并成立俄罗斯运营公司，作为公司长期服务俄罗斯市场、加强本地合作的重要平台。这体现了我们参与俄罗斯市场发展的长期决心。通过此次交流，我们更加认识到，鞑靼斯坦不仅具备良好的产业基础，也具备中国企业开展本地化投资和产业合作的良好条件。</w:t>
+      </w:r>
+    </w:p>
+    <w:p>
+      <w:pPr>
+        <w:spacing w:line="384" w:lineRule="auto" w:after="200"/>
+        <w:ind w:firstLine="420"/>
+      </w:pPr>
+      <w:r>
+        <w:rPr>
+          <w:rFonts w:ascii="Times New Roman" w:hAnsi="Times New Roman" w:eastAsia="宋体"/>
+          <w:b w:val="0"/>
+          <w:sz w:val="32"/>
+        </w:rPr>
+        <w:t>因此，如果未来双方能够围绕重点项目形成稳定合作基础，SRON愿意将鞑靼斯坦作为在俄罗斯进一步深化产业布局的优先选择，并优先研究在当地建设本地化生产和服务能力。</w:t>
+      </w:r>
+    </w:p>
+    <w:p>
+      <w:pPr>
+        <w:spacing w:line="384" w:lineRule="auto" w:after="200"/>
+        <w:ind w:firstLine="420"/>
+      </w:pPr>
+      <w:r>
+        <w:rPr>
+          <w:rFonts w:ascii="Times New Roman" w:hAnsi="Times New Roman" w:eastAsia="宋体"/>
+          <w:b w:val="0"/>
+          <w:sz w:val="32"/>
+        </w:rPr>
+        <w:t>如果合作项目能够顺利落地，我们愿意以项目为基础，以产业为方向，逐步增加在鞑靼斯坦的投入，把更多的技术、设备、人才和服务能力带到当地。</w:t>
       </w:r>
     </w:p>
     <w:p>
@@ -215,7 +341,7 @@
     <w:p>
       <w:pPr>
         <w:spacing w:line="384" w:lineRule="auto" w:after="200"/>
-        <w:ind w:firstLine="839"/>
+        <w:ind w:firstLine="420"/>
       </w:pPr>
       <w:r>
         <w:rPr>
@@ -223,13 +349,13 @@
           <w:b w:val="0"/>
           <w:sz w:val="32"/>
         </w:rPr>
-        <w:t>中国拥有成熟的制造能力、工程经验和完整的产业链配套；俄罗斯拥有丰富的资源、坚实的工业基础和广阔的发展空间。双方优势结合在一起，才能形成有实际成果的合作项目。这次论坛汇聚了两国地方和产业界的力量，本身就是把交流变成合作的平台。</w:t>
+        <w:t>中国拥有成熟的制造能力、工程经验和完整产业链优势；俄罗斯拥有丰富的资源、坚实的工业基础和广阔的发展空间。</w:t>
       </w:r>
     </w:p>
     <w:p>
       <w:pPr>
         <w:spacing w:line="384" w:lineRule="auto" w:after="200"/>
-        <w:ind w:firstLine="839"/>
+        <w:ind w:firstLine="420"/>
       </w:pPr>
       <w:r>
         <w:rPr>
@@ -237,13 +363,13 @@
           <w:b w:val="0"/>
           <w:sz w:val="32"/>
         </w:rPr>
-        <w:t>对 SRON 而言，我们希望以工程项目为起点，以技术合作为纽带，以长期本地化服务为方向，与鞑靼斯坦共同推进粮食仓储现代化、工业散料设施升级和相关基础设施建设。下一步，我们愿意继续与相关部门和企业对接，围绕一到两个具体方向做方案：一是粮食仓储升级与改造，二是工业散料储存和装车配套。论坛期间，我们也欢迎有实际需求的企业和机构与我们见面，把问题谈具体，把方案谈清楚。</w:t>
+        <w:t>河南与鞑靼斯坦之间，也拥有进一步加强产业合作的良好基础。</w:t>
       </w:r>
     </w:p>
     <w:p>
       <w:pPr>
         <w:spacing w:line="384" w:lineRule="auto" w:after="200"/>
-        <w:ind w:firstLine="839"/>
+        <w:ind w:firstLine="420"/>
       </w:pPr>
       <w:r>
         <w:rPr>
@@ -251,7 +377,35 @@
           <w:b w:val="0"/>
           <w:sz w:val="32"/>
         </w:rPr>
-        <w:t>河南实荣筒仓工程有限公司期待与在座各位把 7 月的交流和今天的讨论，尽快落到具体方案和具体项目上，为中俄地方产业合作贡献企业的力量。</w:t>
+        <w:t>我们相信，通过地方政府、企业以及产业机构之间更加深入、务实的交流与合作，可以把双方优势更好地结合起来，形成更多具有实际成果的合作项目。</w:t>
+      </w:r>
+    </w:p>
+    <w:p>
+      <w:pPr>
+        <w:spacing w:line="384" w:lineRule="auto" w:after="200"/>
+        <w:ind w:firstLine="420"/>
+      </w:pPr>
+      <w:r>
+        <w:rPr>
+          <w:rFonts w:ascii="Times New Roman" w:hAnsi="Times New Roman" w:eastAsia="宋体"/>
+          <w:b w:val="0"/>
+          <w:sz w:val="32"/>
+        </w:rPr>
+        <w:t>对于SRON而言，我们希望以工程项目为起点，以技术和产业合作为纽带，以长期本地化发展为方向，与鞑靼斯坦共同探索农业现代化、工业升级和基础设施建设的新机会。</w:t>
+      </w:r>
+    </w:p>
+    <w:p>
+      <w:pPr>
+        <w:spacing w:line="384" w:lineRule="auto" w:after="200"/>
+        <w:ind w:firstLine="420"/>
+      </w:pPr>
+      <w:r>
+        <w:rPr>
+          <w:rFonts w:ascii="Times New Roman" w:hAnsi="Times New Roman" w:eastAsia="宋体"/>
+          <w:b w:val="0"/>
+          <w:sz w:val="32"/>
+        </w:rPr>
+        <w:t>河南实荣筒仓工程有限公司非常期待未来能够与鞑靼斯坦各界朋友建立长期、稳定、深入的合作关系，也期待为河南与鞑靼斯坦之间的地方产业合作贡献企业力量。</w:t>
       </w:r>
     </w:p>
     <w:p>
@@ -271,7 +425,7 @@
     <w:p>
       <w:pPr>
         <w:spacing w:line="384" w:lineRule="auto" w:after="200"/>
-        <w:ind w:firstLine="839"/>
+        <w:ind w:firstLine="420"/>
       </w:pPr>
       <w:r>
         <w:rPr>

</xml_diff>

<commit_message>
Lock the forum speech to the three agreed edits.
Restore the original company introduction, keep the paragraph reorder and jobs line, and drop the extra wording changes.

Co-authored-by: liborvybral-collab <liborvybral-collab@users.noreply.github.com>
</commit_message>
<xml_diff>
--- a/docs/speeches/2026-08/2026-08-萌芽论坛-鞑靼斯坦演讲稿.docx
+++ b/docs/speeches/2026-08/2026-08-萌芽论坛-鞑靼斯坦演讲稿.docx
@@ -153,7 +153,7 @@
           <w:b w:val="0"/>
           <w:sz w:val="32"/>
         </w:rPr>
-        <w:t>河南实荣筒仓工程有限公司是一家面向全球的大宗散料储运工程系统解决方案提供商，为粮食、矿产、建材、煤炭等行业提供筒仓工程系统、封闭料场系统、快速装车系统及码头装卸系统等EPC总承包服务，具备从工程设计、装备制造、施工管理到安装调试及运维服务的全链条交付能力。</w:t>
+        <w:t>河南实荣筒仓工程有限公司是一家面向全球的大宗散料储运工程系统解决方案提供商，专注于为粮食、矿产、建材、煤炭等行业提供安全可靠、技术领先、低碳环保的筒仓工程系统、封闭料场系统、快速装车系统及码头装卸系统等EPC总承包服务，具备从工程设计、装备制造、施工管理到安装调试及运维服务的全链条交付能力。公司深度融合物联网、数字孪生等先进技术打造智慧储运管理系统，实现对物料从卸料、输送、存储到装车的全流程智能化管控与可视化运维，并结合光伏储能、无人机巡检等平台，助力客户提升运营效率，实现节能降耗与可持续发展。</w:t>
       </w:r>
     </w:p>
     <w:p>
@@ -321,7 +321,7 @@
           <w:b w:val="0"/>
           <w:sz w:val="32"/>
         </w:rPr>
-        <w:t>如果合作项目能够顺利落地，我们愿意以项目为基础，以产业为方向，逐步增加在鞑靼斯坦的投入，把更多的技术、设备、人才和服务能力带到当地，并在项目建设和后续运营中创造当地就业、培养本地技术人才。</w:t>
+        <w:t>如果合作项目能够顺利落地，我们愿意以项目为基础，以产业为方向，逐步增加在鞑靼斯坦的投入，把更多的技术、设备、人才和服务能力带到当地。并在项目建设和后续运营中创造当地就业、培养本地技术人才。</w:t>
       </w:r>
     </w:p>
     <w:p>

</xml_diff>